<commit_message>
creation tables xp ok, borderless à corriger
</commit_message>
<xml_diff>
--- a/assets/TEMPLATE.docx
+++ b/assets/TEMPLATE.docx
@@ -12462,7 +12462,7 @@
     <w:name w:val="DC_Table_Year"/>
     <w:basedOn w:val="DCTableContent"/>
     <w:qFormat/>
-    <w:rsid w:val="00ED10F4"/>
+    <w:rsid w:val="009E21FF"/>
     <w:rPr>
       <w:b/>
     </w:rPr>
@@ -12618,7 +12618,7 @@
     <w:name w:val="DC_Table_Content"/>
     <w:basedOn w:val="DCNormal"/>
     <w:qFormat/>
-    <w:rsid w:val="00E7554D"/>
+    <w:rsid w:val="009E21FF"/>
     <w:pPr>
       <w:pBdr>
         <w:top w:val="nil"/>
@@ -12627,7 +12627,8 @@
         <w:right w:val="nil"/>
         <w:between w:val="nil"/>
       </w:pBdr>
-      <w:ind w:left="57"/>
+      <w:spacing w:before="120"/>
+      <w:ind w:left="57" w:right="57"/>
       <w:jc w:val="left"/>
     </w:pPr>
     <w:rPr>
@@ -12640,9 +12641,10 @@
     <w:name w:val="DC_XP_Title"/>
     <w:basedOn w:val="DCNormal"/>
     <w:qFormat/>
-    <w:rsid w:val="00D07DBB"/>
-    <w:pPr>
-      <w:ind w:left="57"/>
+    <w:rsid w:val="009E21FF"/>
+    <w:pPr>
+      <w:spacing w:before="240"/>
+      <w:ind w:left="57" w:right="57"/>
       <w:outlineLvl w:val="1"/>
     </w:pPr>
     <w:rPr>
@@ -12655,9 +12657,10 @@
     <w:name w:val="DC_XP_Date"/>
     <w:basedOn w:val="DCNormal"/>
     <w:qFormat/>
-    <w:rsid w:val="00D07DBB"/>
-    <w:pPr>
-      <w:ind w:right="57"/>
+    <w:rsid w:val="009E21FF"/>
+    <w:pPr>
+      <w:spacing w:before="120"/>
+      <w:ind w:left="57" w:right="57"/>
       <w:jc w:val="right"/>
     </w:pPr>
     <w:rPr>
@@ -12674,9 +12677,10 @@
     <w:name w:val="DC_XP_Poste"/>
     <w:basedOn w:val="DCNormal"/>
     <w:qFormat/>
-    <w:rsid w:val="00D07DBB"/>
-    <w:pPr>
-      <w:ind w:left="57"/>
+    <w:rsid w:val="009E21FF"/>
+    <w:pPr>
+      <w:spacing w:before="120"/>
+      <w:ind w:left="57" w:right="57"/>
     </w:pPr>
     <w:rPr>
       <w:rFonts w:eastAsia="Arial" w:cs="Arial"/>

</xml_diff>

<commit_message>
create education tables ok
</commit_message>
<xml_diff>
--- a/assets/TEMPLATE.docx
+++ b/assets/TEMPLATE.docx
@@ -12402,7 +12402,7 @@
     <w:next w:val="DCNormal"/>
     <w:link w:val="DCT1SectionsCar"/>
     <w:qFormat/>
-    <w:rsid w:val="00C87908"/>
+    <w:rsid w:val="00476156"/>
     <w:pPr>
       <w:spacing w:before="120" w:after="120" w:line="240" w:lineRule="auto"/>
       <w:ind w:left="567"/>
@@ -12412,6 +12412,7 @@
       <w:rFonts w:ascii="Arial" w:eastAsiaTheme="majorEastAsia" w:hAnsi="Arial" w:cstheme="majorBidi"/>
       <w:b/>
       <w:bCs/>
+      <w:smallCaps/>
       <w:color w:val="538CD4"/>
       <w:sz w:val="32"/>
       <w:szCs w:val="28"/>
@@ -12419,19 +12420,17 @@
   </w:style>
   <w:style w:type="paragraph" w:customStyle="1" w:styleId="DC1stbullet">
     <w:name w:val="DC_1st_bullet"/>
-    <w:basedOn w:val="DCT1Sections"/>
+    <w:basedOn w:val="DCNormal"/>
     <w:qFormat/>
-    <w:rsid w:val="00F16470"/>
-    <w:pPr>
-      <w:spacing w:before="0"/>
-      <w:ind w:left="0"/>
+    <w:rsid w:val="001E2384"/>
+    <w:pPr>
       <w:outlineLvl w:val="2"/>
     </w:pPr>
     <w:rPr>
+      <w:b/>
       <w:color w:val="EC7C2F"/>
       <w:sz w:val="24"/>
       <w:szCs w:val="26"/>
-      <w:lang w:val="fr-FR"/>
     </w:rPr>
   </w:style>
   <w:style w:type="paragraph" w:customStyle="1" w:styleId="DCTableBlueTitle">
@@ -12535,11 +12534,12 @@
     <w:name w:val="DC_T1_Sections Car"/>
     <w:basedOn w:val="Policepardfaut"/>
     <w:link w:val="DCT1Sections"/>
-    <w:rsid w:val="00C87908"/>
+    <w:rsid w:val="00476156"/>
     <w:rPr>
       <w:rFonts w:ascii="Arial" w:eastAsiaTheme="majorEastAsia" w:hAnsi="Arial" w:cstheme="majorBidi"/>
       <w:b/>
       <w:bCs/>
+      <w:smallCaps/>
       <w:color w:val="538CD4"/>
       <w:sz w:val="32"/>
       <w:szCs w:val="28"/>
@@ -12576,7 +12576,6 @@
       </w:pBdr>
       <w:ind w:left="993" w:hanging="426"/>
       <w:contextualSpacing/>
-      <w:jc w:val="both"/>
       <w:outlineLvl w:val="9"/>
     </w:pPr>
     <w:rPr>
@@ -12639,17 +12638,18 @@
   </w:style>
   <w:style w:type="paragraph" w:customStyle="1" w:styleId="DCXPTitle">
     <w:name w:val="DC_XP_Title"/>
-    <w:basedOn w:val="DCNormal"/>
+    <w:basedOn w:val="DCT1Sections"/>
     <w:qFormat/>
-    <w:rsid w:val="009E21FF"/>
+    <w:rsid w:val="00476156"/>
     <w:pPr>
       <w:spacing w:before="240"/>
       <w:ind w:left="57" w:right="57"/>
       <w:outlineLvl w:val="1"/>
     </w:pPr>
     <w:rPr>
+      <w:b w:val="0"/>
+      <w:smallCaps w:val="0"/>
       <w:color w:val="808080" w:themeColor="background1" w:themeShade="80"/>
-      <w:sz w:val="32"/>
       <w:szCs w:val="32"/>
     </w:rPr>
   </w:style>

</xml_diff>

<commit_message>
détection année 19-- et corr style
Co-authored-by: Copilot <copilot@github.com>
</commit_message>
<xml_diff>
--- a/assets/TEMPLATE.docx
+++ b/assets/TEMPLATE.docx
@@ -1354,7 +1354,7 @@
   <w:style w:type="paragraph" w:default="1" w:styleId="Normal">
     <w:name w:val="Normal"/>
     <w:qFormat/>
-    <w:rsid w:val="004B0E2D"/>
+    <w:rsid w:val="00E7484B"/>
     <w:pPr>
       <w:spacing w:after="60"/>
     </w:pPr>
@@ -12649,9 +12649,9 @@
     <w:name w:val="DC_XP_Title"/>
     <w:basedOn w:val="DCNormal"/>
     <w:qFormat/>
-    <w:rsid w:val="009E21FF"/>
-    <w:pPr>
-      <w:spacing w:before="240"/>
+    <w:rsid w:val="00E7484B"/>
+    <w:pPr>
+      <w:spacing w:before="120"/>
       <w:ind w:left="57" w:right="57"/>
       <w:outlineLvl w:val="1"/>
     </w:pPr>

</xml_diff>